<commit_message>
feat: add multi-format ingestion, DOCX export, and fix RIPA test suite
Add multi-format document parsing (plaintext, docx, csv/xlsx, pptx) in
orchestrator. Refactor DOCX narrative export into core/docx_builder.py.
Fix BlastRadiusCalculator tests to align with RIPA-based SVI model and
use dict-keyed row access for sqlite3.Row compatibility.

Co-Authored-By: Claude Opus 4.6 <noreply@anthropic.com>
</commit_message>
<xml_diff>
--- a/templates/narrative_report.docx
+++ b/templates/narrative_report.docx
@@ -76,15 +76,6 @@
         <w:t>Key Findings</w:t>
       </w:r>
     </w:p>
-    <w:p>
-      <w:r>
-        <w:rPr>
-          <w:color w:val="FFFFFF"/>
-          <w:sz w:val="2"/>
-        </w:rPr>
-        <w:t>{%tr for f in key_findings %}</w:t>
-      </w:r>
-    </w:p>
     <w:tbl>
       <w:tblPr>
         <w:tblStyle w:val="TableGrid"/>
@@ -154,7 +145,7 @@
           </w:tcPr>
           <w:p>
             <w:r>
-              <w:t>{{ f.severity }}</w:t>
+              <w:t>{%tr for f in key_findings %}{{ f.severity }}</w:t>
             </w:r>
           </w:p>
         </w:tc>
@@ -174,21 +165,12 @@
           </w:tcPr>
           <w:p>
             <w:r>
-              <w:t>{{ f.impact }}</w:t>
+              <w:t>{{ f.impact }}{%tr endfor %}</w:t>
             </w:r>
           </w:p>
         </w:tc>
       </w:tr>
     </w:tbl>
-    <w:p>
-      <w:r>
-        <w:rPr>
-          <w:color w:val="FFFFFF"/>
-          <w:sz w:val="2"/>
-        </w:rPr>
-        <w:t>{%tr endfor %}</w:t>
-      </w:r>
-    </w:p>
     <w:p>
       <w:r>
         <w:br w:type="page"/>
@@ -245,15 +227,6 @@
           <w:color w:val="1E3A5F"/>
         </w:rPr>
         <w:t>Appendix A: Issue Register</w:t>
-      </w:r>
-    </w:p>
-    <w:p>
-      <w:r>
-        <w:rPr>
-          <w:color w:val="FFFFFF"/>
-          <w:sz w:val="2"/>
-        </w:rPr>
-        <w:t>{%tr for issue in issue_register %}</w:t>
       </w:r>
     </w:p>
     <w:tbl>
@@ -359,7 +332,7 @@
           </w:tcPr>
           <w:p>
             <w:r>
-              <w:t>{{ issue.severity }}</w:t>
+              <w:t>{%tr for issue in issue_register %}{{ issue.severity }}</w:t>
             </w:r>
           </w:p>
         </w:tc>
@@ -399,21 +372,12 @@
           </w:tcPr>
           <w:p>
             <w:r>
-              <w:t>{{ issue.description }}</w:t>
+              <w:t>{{ issue.description }}{%tr endfor %}</w:t>
             </w:r>
           </w:p>
         </w:tc>
       </w:tr>
     </w:tbl>
-    <w:p>
-      <w:r>
-        <w:rPr>
-          <w:color w:val="FFFFFF"/>
-          <w:sz w:val="2"/>
-        </w:rPr>
-        <w:t>{%tr endfor %}</w:t>
-      </w:r>
-    </w:p>
     <w:p>
       <w:r>
         <w:br w:type="page"/>

</xml_diff>